<commit_message>
Update CI workflow and documentation: remove nightly schedule, clarify test execution triggers
</commit_message>
<xml_diff>
--- a/docs/ParaBank_Test_Automation_Framework_Documentation.docx
+++ b/docs/ParaBank_Test_Automation_Framework_Documentation.docx
@@ -1640,7 +1640,7 @@
               <w:rPr>
                 <w:sz w:val="20"/>
               </w:rPr>
-              <w:t>Nightly</w:t>
+              <w:t>In the full suite, started by hand from the Actions tab</w:t>
             </w:r>
           </w:p>
         </w:tc>
@@ -2197,7 +2197,7 @@
               <w:rPr>
                 <w:sz w:val="20"/>
               </w:rPr>
-              <w:t>Cloud runs on every change and nightly, with reports kept as downloadable artifacts</w:t>
+              <w:t>Cloud runs on every push; the full suite on demand from the Actions tab, with reports kept as downloadable artifacts</w:t>
             </w:r>
           </w:p>
         </w:tc>
@@ -6491,16 +6491,16 @@
         <w:t>Every time code is pushed</w:t>
       </w:r>
       <w:r>
-        <w:t xml:space="preserve">, GitHub starts a clean virtual machine, installs the project, runs both quality gates and then the 32 P1 tests, and stores the report as a downloadable artifact. </w:t>
+        <w:t xml:space="preserve">, GitHub starts a clean virtual machine, installs the project, runs both quality gates and then the 32 P1 tests, and stores the report as a downloadable artifact. The </w:t>
       </w:r>
       <w:r>
         <w:rPr>
           <w:b/>
         </w:rPr>
-        <w:t>Every night at 02:00 UTC</w:t>
+        <w:t>full 63</w:t>
       </w:r>
       <w:r>
-        <w:t xml:space="preserve"> it runs the full 63. A red result blocks the change.</w:t>
+        <w:t xml:space="preserve"> run whenever someone starts the workflow by hand from the Actions tab (Run workflow); there is deliberately no timed schedule. A red result blocks the change.</w:t>
       </w:r>
     </w:p>
     <w:p>
@@ -11345,7 +11345,7 @@
               <w:rPr>
                 <w:sz w:val="19"/>
               </w:rPr>
-              <w:t>Continuous Integration: P1 on every push, full suite nightly</w:t>
+              <w:t>Continuous Integration: P1 on every push, full suite on demand</w:t>
             </w:r>
           </w:p>
         </w:tc>

</xml_diff>